<commit_message>
Update the snapshot (2026-10-17 18:36)
Co-Authored-By: Claude Opus 5.5 <noreply@anthropic.com>
</commit_message>
<xml_diff>
--- a/docs/paper/overview/draft_ja_tsg_20261015.docx
+++ b/docs/paper/overview/draft_ja_tsg_20261015.docx
@@ -6971,7 +6971,7 @@
           <w:i w:val="0"/>
           <w:sz w:val="20"/>
         </w:rPr>
-        <w:t>同じ入札と制御の40組を、PJMの5分の点数で採点し直した（表VIII）［16］。5分に1点で採点しているので、PJMの10秒ごとの採点より粗い。分散MARLの点数の平均は94.5%で、支払いが0になる25%未満の5分は0.03%だった。直近100時間の平均の最小は92.3%で、参加資格の基準（40%）を保った。日本の判定では74.9%のコマしか合格しない制御が、PJMの規則では支払いの減りもわずかで参加を続けられる。さらに、入札もPJMの規則（上げと下げは同じ量、5分の出力の上下限）で作り、その帯で行動器を学習し直した。この場合の分散MARLの点数は93.6%で、日本の規則の入札と行動器（94.5%）とほぼ同じだった。入札量は13%小さく、出発時のSoC達成率は63.3%で、日本の規則の72.4%より低かった。全情報のLPは40組すべてで成り立った。</w:t>
+        <w:t>同じ入札と制御の40組を、PJMの性能スコアの式で採点し直した（表VIII）［16］。本研究のPJMの指令は、2秒ごとに変わるRegDを5分点で取り出したもので、制御も5分ごとに動く。PJMは2秒ごとの信号への応答を10秒ごとに採点するので、ここでの点数は実際の採点より粗く、秒単位の追従の難しさを含まない。この採点では、分散MARLの点数の平均は94.5%、支払いが0になる25%未満の5分は0.03%、直近100時間の平均の最小は92.3%で、参加資格の基準（認証は75%、継続は40%）を上回った。日本の判定では74.9%のコマしか合格しない制御が、この採点では支払いの減りもわずかである。さらに、入札もPJMの規則（上げと下げは同じ量、5分の出力の上下限）で作り、その帯で行動器を学習し直した。この場合の分散MARLの点数は93.6%で、日本の規則の入札と行動器（94.5%）とほぼ同じだった。入札量は13%小さく、出発時のSoC達成率は63.3%で、日本の規則の72.4%より低かった。全情報のLPは40組すべてで成り立った。</w:t>
       </w:r>
     </w:p>
     <w:p>
@@ -7708,7 +7708,7 @@
           <w:i w:val="0"/>
           <w:sz w:val="20"/>
         </w:rPr>
-        <w:t>日本の二次②は、コマごとの合否と月3回の停止によって、PJMのような点数型の市場より厳しい。同じ制御がPJMの点数では参加を続けられたことから、分散MARLを使えるかどうかは、市場の判定の形で大きく変わる。</w:t>
+        <w:t>日本の二次②は、コマごとの合否と月3回の停止によって、PJMのような点数型の市場より厳しい。同じ制御が、5分の粗さで当てたPJMの点数では参加資格の基準を上回ったことから、分散MARLを使えるかどうかは、市場の判定の形で大きく変わる可能性がある。秒単位で変わる実際の信号で同じことが言えるかは、測っていない。</w:t>
       </w:r>
     </w:p>
     <w:p>

</xml_diff>